<commit_message>
Write 'Modern C++' instead of 'C++ (modern)'
'Modern C++' is the standard phrase on CVs and in job ads. The master
title line lists 'Rust, C, C++' instead of 'C/C++'.
</commit_message>
<xml_diff>
--- a/Career-Roadmap/CV/master-cv.docx
+++ b/Career-Roadmap/CV/master-cv.docx
@@ -31,7 +31,7 @@
           <w:color w:val="1B2A47"/>
           <w:sz w:val="24"/>
         </w:rPr>
-        <w:t>Software Engineer  |  Rust, C/C++, Linux, Embedded</w:t>
+        <w:t>Software Engineer  |  Rust, C, C++, Linux, Embedded</w:t>
       </w:r>
     </w:p>
     <w:p>
@@ -961,7 +961,7 @@
           <w:i w:val="0"/>
           <w:sz w:val="20"/>
         </w:rPr>
-        <w:t>Rust, C, C++ (modern), Python (asyncio), Java, C#, SQL, JavaScript, Bash, Verilog/VHDL, MATLAB</w:t>
+        <w:t>Rust, C, Modern C++, Python (asyncio), Java, C#, SQL, JavaScript, Bash, Verilog/VHDL, MATLAB</w:t>
       </w:r>
     </w:p>
     <w:p>

</xml_diff>